<commit_message>
Review 2 robustness pass: corrected version (23 October 2026)
Search expanded (citation chasing, 489 new records; OpenAlex full retrieval, arXiv and Semantic Scholar blocked after retries, logged as blocked). All 913 screening disagreements re-adjudicated by reading (agreement with the v1 coded rule 80.0 percent); 37 new studies from re-adjudication, 2 from chasing. Second fully independent extraction of every study; every discrepancy settled against the source (robustness-discrepancy-log.md). One duplicate study merged (Jedrzejczak 2024 = preprint of Pastucha 2026): 63 generation studies, 148 arms. Risk of bias re-adjudicated by reading, replacing more-cautious-wins (high 30, some concerns 33, low 0). Pooled: fabricated 19.4% (14.9-24.8), major inaccuracy 16.5% (5.7-39.2), fully accurate 37.0% (27.2-47.9). Forest plots regenerated with diamonds; PDF visually inspected page by page.

Signed-off-by: Raphael Malikian <rtmalikian@gmail.com>
</commit_message>
<xml_diff>
--- a/journal-package/manuscript.docx
+++ b/journal-package/manuscript.docx
@@ -51,6 +51,14 @@
           <w:sz w:val="22"/>
         </w:rPr>
         <w:t>Protocol version 1.0, 22 October 2026 (protocol.md, this series). Registration: no PROSPERO registration number was issued before analysis. A PROSPERO-ready form was prepared before screening (prospero-form.md) and an OSF record is the transparent parallel route. No registration is backdated or implied anywhere in this review.</w:t>
+      </w:r>
+    </w:p>
+    <w:p>
+      <w:r>
+        <w:rPr>
+          <w:sz w:val="22"/>
+        </w:rPr>
+        <w:t>Version note: this is the corrected version of the review first published on 22 October 2026. A robustness pass on 23 October 2026, after first publication, closed three process gaps that the first version disclosed (a coded adjudication rule at screening, a single extraction with verification, and a mechanical risk of bias adjudication rule) and corrected the dataset and every pooled estimate. The amendment is logged in the Methods (section 1) and in llm-team-log.md. The first version stands as published; nothing in it has been silently altered, and the first version's analysis files are preserved in the repository.</w:t>
       </w:r>
     </w:p>
     <w:p>
@@ -134,7 +142,7 @@
         <w:rPr>
           <w:sz w:val="22"/>
         </w:rPr>
-        <w:t xml:space="preserve"> PubMed, Europe PMC, OpenAIRE, Crossref and an OpenAlex test page were searched on 22 October 2026, with exact strings, dates and hit counts in the search log. arXiv and Semantic Scholar were attempted and blocked by rate limits and are logged as blocked. Embase, Scopus and Web of Science strings were prepared and are marked run pending access. No language limit was applied at search.</w:t>
+        <w:t xml:space="preserve"> PubMed, Europe PMC, OpenAIRE, Crossref and an OpenAlex test page were searched on 22 October 2026, with exact strings, dates and hit counts in the search log. arXiv and Semantic Scholar were attempted and blocked by rate limits and are logged as blocked. Embase, Scopus and Web of Science strings were prepared and are marked run pending access. No language limit was applied at search. In the robustness pass (23 October 2026), full OpenAlex retrieval and further arXiv and Semantic Scholar retries were attempted and blocked again after retries (HTTP 429), and systematic citation chasing of all included studies and two competing reviews added 489 new records, of which 2 studies were included.</w:t>
       </w:r>
     </w:p>
     <w:p>
@@ -234,7 +242,7 @@
         <w:rPr>
           <w:sz w:val="22"/>
         </w:rPr>
-        <w:t xml:space="preserve"> 15,985 records were screened. Twenty five generation experiments (69 model arms) and one published literature audit met the rules.</w:t>
+        <w:t xml:space="preserve"> 16,474 records were screened (15,985 from the database search and 489 from citation chasing). Sixty three generation experiments (148 model arms) and one published literature audit met the rules.</w:t>
       </w:r>
     </w:p>
     <w:p>
@@ -254,7 +262,7 @@
         <w:rPr>
           <w:sz w:val="22"/>
         </w:rPr>
-        <w:t xml:space="preserve"> Completely fabricated: pooled 18.6 percent (95% CI 12.8 to 26.3), 51 arms, 18 studies, 12,828 references, I squared 97.7 percent, prediction interval 0.9 to 84.7 percent, GRADE very low. Fully accurate: pooled 29.4 percent (19.5 to 41.7), 42 arms, 13 studies, 12,002 references, I squared 98.5 percent, GRADE very low. Any major inaccuracy: pooled 36.0 percent (19.8 to 56.3), 9 arms, 5 studies, 1,537 references, I squared 96.1 percent, GRADE very low. Per study sensitivity pools gave 23.0 percent fabricated and 41.2 percent fully accurate. Arms with retrieval or browsing active pooled 5.0 percent fabricated against 25.1 percent for arms with retrieval off. The audit stratum, reported apart, found fabricated citations in published papers rising from about 1 in 2,828 papers in 2023 to about 1 in 277 in early 2026.</w:t>
+        <w:t xml:space="preserve"> Completely fabricated: pooled 19.4 percent (95% CI 14.9 to 24.8), 113 arms, 50 studies, 22,461 references, I squared 97.1 percent, prediction interval 1.0 to 85.6 percent, GRADE very low. Fully accurate: pooled 37.0 percent (27.2 to 47.9), 58 arms, 28 studies, 14,224 references, I squared 98.2 percent, GRADE very low. Any major inaccuracy: pooled 16.5 percent (5.7 to 39.2), 20 arms, 14 studies, 2,668 references, I squared 96.7 percent, GRADE very low. Per study sensitivity pools gave 24.7 percent fabricated and 38.2 percent fully accurate. Arms with retrieval, browsing or database access active pooled 5.8 percent fabricated (26 arms) against 31.0 percent for arms with retrieval off (50 arms). The audit stratum, reported apart, found fabricated citations in published papers rising from about 1 in 2,828 papers in 2023 to about 1 in 277 in early 2026.</w:t>
       </w:r>
     </w:p>
     <w:p>
@@ -274,7 +282,7 @@
         <w:rPr>
           <w:sz w:val="22"/>
         </w:rPr>
-        <w:t xml:space="preserve"> In these experiments, roughly one generated biomedical reference in five did not exist, and fewer than one in three was fully accurate. The spread between models and setups was wider than any average, so the pooled figures describe a literature, not a property of a named product. Verification of every generated reference against a database is the only step in this literature that consistently separated usable lists from unusable ones. Certainty is very low throughout, mainly because verification conduct was poorly reported and heterogeneity stayed high after every pre-specified subgroup.</w:t>
+        <w:t xml:space="preserve"> In these experiments, roughly one generated biomedical reference in five did not exist, and just over one in three was fully accurate. The spread between models and setups was wider than any average, so the pooled figures describe a literature, not a property of a named product. Verification of every generated reference against a database is the only step in this literature that consistently separated usable lists from unusable ones. Certainty is very low throughout, mainly because verification conduct was poorly reported and heterogeneity stayed high after every pre-specified subgroup.</w:t>
       </w:r>
     </w:p>
     <w:p>
@@ -323,7 +331,7 @@
         <w:rPr>
           <w:sz w:val="22"/>
         </w:rPr>
-        <w:t>The plain language summary is filed as plain-language-summary.md and reproduced in the repository README. In short: of every 100 references a model generated in these experiments, about 19 did not exist and about 29 were fully accurate. Rates varied sharply by model and by whether web access was on. A separate audit found fabricated citations already sitting in published papers, and rising fast between 2023 and 2026. The quality of the underlying studies was weak enough that all main results carry very low certainty.</w:t>
+        <w:t>The plain language summary is filed as plain-language-summary.md and reproduced in the repository README. In short: of every 100 references a model generated in these experiments, about 19 did not exist and about 37 were fully accurate. Rates varied sharply by model and by whether web access was on. A separate audit found fabricated citations already sitting in published papers, and rising fast between 2023 and 2026. The quality of the underlying studies was weak enough that all main results carry very low certainty.</w:t>
       </w:r>
     </w:p>
     <w:p>
@@ -457,7 +465,7 @@
           </w:tcPr>
           <w:p>
             <w:r>
-              <w:t>51</w:t>
+              <w:t>113</w:t>
             </w:r>
           </w:p>
         </w:tc>
@@ -467,7 +475,7 @@
           </w:tcPr>
           <w:p>
             <w:r>
-              <w:t>18</w:t>
+              <w:t>50</w:t>
             </w:r>
           </w:p>
         </w:tc>
@@ -477,7 +485,7 @@
           </w:tcPr>
           <w:p>
             <w:r>
-              <w:t>12,828</w:t>
+              <w:t>22,461</w:t>
             </w:r>
           </w:p>
         </w:tc>
@@ -487,7 +495,7 @@
           </w:tcPr>
           <w:p>
             <w:r>
-              <w:t>18.6% (12.8 to 26.3)</w:t>
+              <w:t>19.4% (14.9 to 24.8)</w:t>
             </w:r>
           </w:p>
         </w:tc>
@@ -497,7 +505,7 @@
           </w:tcPr>
           <w:p>
             <w:r>
-              <w:t>97.7%</w:t>
+              <w:t>97.1%</w:t>
             </w:r>
           </w:p>
         </w:tc>
@@ -517,7 +525,7 @@
           </w:tcPr>
           <w:p>
             <w:r>
-              <w:t>Risk of bias down 1 (15 of 25 studies at high risk on the adapted tool, verification conduct often unreported); inconsistency down 1 (prediction interval 0.9 to 84.7%); indirectness down 1 (experimental lists stand in for real manuscript drafting)</w:t>
+              <w:t>Risk of bias down 1 (30 of 63 studies at high risk on the adapted tool, verification conduct often unreported); inconsistency down 1 (prediction interval 1.0 to 85.6%); indirectness down 1 (experimental lists stand in for real manuscript drafting)</w:t>
             </w:r>
           </w:p>
         </w:tc>
@@ -539,7 +547,7 @@
           </w:tcPr>
           <w:p>
             <w:r>
-              <w:t>9</w:t>
+              <w:t>20</w:t>
             </w:r>
           </w:p>
         </w:tc>
@@ -549,7 +557,7 @@
           </w:tcPr>
           <w:p>
             <w:r>
-              <w:t>5</w:t>
+              <w:t>14</w:t>
             </w:r>
           </w:p>
         </w:tc>
@@ -559,7 +567,7 @@
           </w:tcPr>
           <w:p>
             <w:r>
-              <w:t>1,537</w:t>
+              <w:t>2,668</w:t>
             </w:r>
           </w:p>
         </w:tc>
@@ -569,7 +577,7 @@
           </w:tcPr>
           <w:p>
             <w:r>
-              <w:t>36.0% (19.8 to 56.3)</w:t>
+              <w:t>16.5% (5.7 to 39.2)</w:t>
             </w:r>
           </w:p>
         </w:tc>
@@ -579,7 +587,7 @@
           </w:tcPr>
           <w:p>
             <w:r>
-              <w:t>96.1%</w:t>
+              <w:t>96.7%</w:t>
             </w:r>
           </w:p>
         </w:tc>
@@ -599,7 +607,7 @@
           </w:tcPr>
           <w:p>
             <w:r>
-              <w:t>Risk of bias down 1; inconsistency down 1; imprecision down 1 (5 studies, wide interval)</w:t>
+              <w:t>Risk of bias down 1; inconsistency down 1; imprecision down 1 (wide interval)</w:t>
             </w:r>
           </w:p>
         </w:tc>
@@ -621,7 +629,7 @@
           </w:tcPr>
           <w:p>
             <w:r>
-              <w:t>42</w:t>
+              <w:t>58</w:t>
             </w:r>
           </w:p>
         </w:tc>
@@ -631,7 +639,7 @@
           </w:tcPr>
           <w:p>
             <w:r>
-              <w:t>13</w:t>
+              <w:t>28</w:t>
             </w:r>
           </w:p>
         </w:tc>
@@ -641,7 +649,7 @@
           </w:tcPr>
           <w:p>
             <w:r>
-              <w:t>12,002</w:t>
+              <w:t>14,224</w:t>
             </w:r>
           </w:p>
         </w:tc>
@@ -651,7 +659,7 @@
           </w:tcPr>
           <w:p>
             <w:r>
-              <w:t>29.4% (19.5 to 41.7)</w:t>
+              <w:t>37.0% (27.2 to 47.9)</w:t>
             </w:r>
           </w:p>
         </w:tc>
@@ -661,7 +669,7 @@
           </w:tcPr>
           <w:p>
             <w:r>
-              <w:t>98.5%</w:t>
+              <w:t>98.2%</w:t>
             </w:r>
           </w:p>
         </w:tc>
@@ -681,7 +689,7 @@
           </w:tcPr>
           <w:p>
             <w:r>
-              <w:t>Risk of bias down 1; inconsistency down 1 (prediction interval 1.1 to 93.8%); indirectness down 1</w:t>
+              <w:t>Risk of bias down 1; inconsistency down 1 (prediction interval 1.9 to 94.8%); indirectness down 1</w:t>
             </w:r>
           </w:p>
         </w:tc>
@@ -804,7 +812,7 @@
         <w:pStyle w:val="Heading2"/>
       </w:pPr>
       <w:r>
-        <w:t>1. Differences between protocol and review</w:t>
+        <w:t>1. Differences between protocol and review, and the post-publication robustness amendment</w:t>
       </w:r>
     </w:p>
     <w:p>
@@ -812,7 +820,15 @@
         <w:rPr>
           <w:sz w:val="22"/>
         </w:rPr>
-        <w:t>Four differences, each logged with its reason. First, the strict second pass over abstracts was applied at the full text stage rather than before retrieval, because open access retrieval for all 122 stage 1 survivors was automated (Europe PMC then Unpaywall) and cost less than a separate pass; every retrieved report still received a full text decision with one exclusion reason. Second, analysis ran in Python rather than R, because no R installation was available in the working environment; the protocol named Python with a logit model as the stated fallback, and the code is published with the review. Third, the model year subgroup could not be run as specified: primary studies rarely printed a model year apart from the model version, so that subgroup is reported as not estimable rather than rebuilt from publication year, which would answer a different question. Fourth, list length subgrouping used references requested where a study printed it (17 of 42 fully accurate arms and 4 of 9 major inaccuracy arms carried a usable requested count); arms without a printed requested count sit in a not reported group and are not assigned a list length from their generated count. No outcome definition changed after extraction began. No eligibility rule changed.</w:t>
+        <w:t>Amendment, 23 October 2026 (after first publication; this entry is dated and is not backdated). The first version of this review (22 October 2026) disclosed three step-downs from the full Cochrane-level process in its own text: screening disagreements were settled by a coded adjudication rule rather than by reading; extraction was a single extraction with a verification pass rather than two independent extractions; and risk of bias disagreements were settled by taking the more cautious judgement rather than by reading. The author directed that all three be closed, and a robustness pass was run on 23 October 2026. In that pass: (1) an adjudicator read all 913 stage 1 disagreement records and passed 190 to full text, of which 161 had never been sought; 95 were retrieved and assessed, and 37 further generation studies were included; (2) the search was expanded by systematic citation chasing (979 candidates from the reference lists and citing works of the included studies and of two competing reviews, run through Europe PMC and Crossref; 489 genuinely new records, dual screened with adjudication by reading; 10 reports sought, 7 retrieved, 2 studies included), and full OpenAlex retrieval plus renewed arXiv and Semantic Scholar attempts were made and blocked again after retries (HTTP 429), logged as blocked and never as searched; (3) every included study received a second, fully independent extraction, the two passes were compared field by field by code (825 field cells compared on matched arms of the original studies where both passes had an entry; most string level differences were wording in free text fields such as definitions notes and source locations; on the numeric inputs to the pools, 25 of 201 compared cells differed), and every discrepancy was settled by re-reading the source, with the settled value, the source location and the wrong pass recorded in robustness-discrepancy-log.md; (4) every risk of bias disagreement, in the original set and the new studies, was settled by an adjudicator reading the paper, and the more-cautious-wins rule was not used. The pass also found, on re-reading, that one included study (Jedrzejczak 2024) is the preprint of another (Pastucha 2026, whose acknowledgements name the preprint as an earlier version of the same manuscript, with identical data for the shared arms); the two reports are now merged at study level and counted once, under Pastucha 2026. Pooled estimates were re-run on the corrected dataset; the first version's figures are preserved in the repository (robustness/v1/) and the before and after estimates are reported side by side in the team log. This corrected version replaces the first version's numbers everywhere; the first version itself stands as published and has not been edited.</w:t>
+      </w:r>
+    </w:p>
+    <w:p>
+      <w:r>
+        <w:rPr>
+          <w:sz w:val="22"/>
+        </w:rPr>
+        <w:t>Four differences from the protocol, each logged with its reason. First, the strict second pass over abstracts was applied at the full text stage rather than before retrieval, because open access retrieval for all 122 stage 1 survivors was automated (Europe PMC then Unpaywall) and cost less than a separate pass; every retrieved report still received a full text decision with one exclusion reason. Second, analysis ran in Python rather than R, because no R installation was available in the working environment; the protocol named Python with a logit model as the stated fallback, and the code is published with the review. Third, the model year subgroup could not be run as specified: primary studies rarely printed a model year apart from the model version, so that subgroup is reported as not estimable rather than rebuilt from publication year, which would answer a different question. Fourth, list length subgrouping used references requested where a study printed it; arms without a printed requested count sit in a not reported group and are not assigned a list length from their generated count. No outcome definition changed after extraction began. No eligibility rule changed.</w:t>
       </w:r>
     </w:p>
     <w:p>
@@ -884,7 +900,7 @@
         <w:rPr>
           <w:sz w:val="22"/>
         </w:rPr>
-        <w:t>Databases and sources searched on 22 October 2026: PubMed through NCBI E-utilities (372 retrieved), Europe PMC REST API with cursor paging (14,090 retrieved, string not restricted to title and abstract, a breadth decision that is logged and that screening absorbed), OpenAIRE (10), Crossref bibliographic and posted content queries (1,000 records retrieved from each; the total-results figures of 1,507,235 and 122,445 are relevance match counts and were never treated as result sets), and an OpenAlex test page (25 records; full retrieval not run). arXiv timed out and then returned HTTP 429; Semantic Scholar returned HTTP 429 on its test call. Both are logged as attempted and blocked. Embase, Scopus and Web of Science were not searched: no licensed access was available, and ready to run strings for each sit in search-appendix-pending.md, marked string prepared, run pending access. This review does not claim those databases were searched. Reference lists of included studies and of the existing hallucination reviews informed background checking; no additional eligible study entered through chasing that was not already in the search set. Full strings as run sit in search-log.md.</w:t>
+        <w:t>Databases and sources searched on 22 October 2026: PubMed through NCBI E-utilities (372 retrieved), Europe PMC REST API with cursor paging (14,090 retrieved, string not restricted to title and abstract, a breadth decision that is logged and that screening absorbed), OpenAIRE (10), Crossref bibliographic and posted content queries (1,000 records retrieved from each; the total-results figures of 1,507,235 and 122,445 are relevance match counts and were never treated as result sets), and an OpenAlex test page (25 records; full retrieval not run in the first pass). arXiv timed out and then returned HTTP 429; Semantic Scholar returned HTTP 429 on its test call. Both are logged as attempted and blocked. Embase, Scopus and Web of Science were not searched: no licensed access was available, and ready to run strings for each sit in search-appendix-pending.md, marked string prepared, run pending access. This review does not claim those databases were searched. In the robustness pass (23 October 2026), full OpenAlex retrieval was attempted three times and blocked (HTTP 429; the shared network budget was exhausted), arXiv was retried by two routes (timeout, then HTTP 429) and Semantic Scholar by two routes (HTTP 429 on both); all are logged as blocked after retries, never as searched. Systematic citation chasing was then run on the reference lists and citing works of all 26 first version included studies and of the two competing reviews named in the Background (Basu and Huynh 2026; Topaz 2026), through Europe PMC with a Crossref fallback: 979 raw candidates, 454 already in the search set, 36 within-set duplicates, and 489 genuinely new records, which were abstract-enriched from Europe PMC (404 of 489) and dual screened; 2 further studies entered through chasing. Full strings as run sit in search-log.md, with the robustness pass in its own dated section.</w:t>
       </w:r>
     </w:p>
     <w:p>
@@ -900,7 +916,7 @@
         <w:rPr>
           <w:sz w:val="22"/>
         </w:rPr>
-        <w:t>Selection of studies. Two LLM screeners with different written rules (A strict, B sensitive) screened all 15,985 deduplicated titles and abstracts apart. Agreement was 94.29 percent; Cohen kappa was 0.13, a prevalence effect described in the team log. A coded adjudication rule passed 122 records to full text. Full texts were sought for all 122; 76 were retrieved open access and 46 were not retrieved and are listed in flagged-for-author.md. Full text decisions were made by extractors in three batches, with a fourth batch for re-retrieved records, each exclusion carrying one reason.</w:t>
+        <w:t>Selection of studies. Two LLM screeners with different written rules (A strict, B sensitive) screened all 15,985 deduplicated titles and abstracts apart. Agreement was 94.29 percent; Cohen kappa was 0.13, a prevalence effect described in the team log. In the first version, a coded adjudication rule passed 122 records to full text. In the robustness pass, an adjudicator read every one of the 913 disagreement records (all of them B-only) and passed 190 to full text (28 include, 162 maybe); agreement between the real adjudication and the coded rule, on a pass or fail basis, was 80.0 percent: the coded rule had passed 22 records the adjudicator excluded, and had dropped 161 records the adjudicator passed. None of the 22 had reached the first version's included set, and none of the 25 first version studies was excluded by the adjudicator, who called all 12 of their disagreement-set records include or maybe. Full texts were sought for all 293 reports across the three streams (122 first pass, 161 re-adjudicated, 10 from chasing); 178 were retrieved open access and 115 were not retrieved. Full text decisions were made by reviewers reading each text, each exclusion carrying one reason.</w:t>
       </w:r>
     </w:p>
     <w:p>
@@ -908,7 +924,7 @@
         <w:rPr>
           <w:sz w:val="22"/>
         </w:rPr>
-        <w:t>Data collection and management. Extraction followed extraction-form.md: 57 fields across identity, topic, per arm model and setup, verification, definitions as printed, counts as printed, funding and conflicts, plus a separate audit section. Percentages were never back calculated into counts unless the count was also printed, with one stated exception: where a paper printed integer percentages against a printed denominator of 100 references per model and the derived counts summed exactly to the paper's printed pooled totals (Seifi 2026), the derived counts were entered and flagged derived in every affected row. A verification pass then checked analysis totals against the extraction sheet by hand and checked named arms against their papers (details in llm-team-log.md).</w:t>
+        <w:t>Data collection and management. Extraction followed extraction-form.md: 57 fields across identity, topic, per arm model and setup, verification, definitions as printed, counts as printed, funding and conflicts, plus a separate audit section; the analysis dataset carries the 25 fields that feed the pools. Percentages were never back calculated into counts unless the count was also printed, with one stated exception: where a paper printed percentages against a stated denominator and exactly one whole count reproduces the printed percentage (or, for Seifi 2026, integer percentages against a printed denominator of 100 per model whose derived counts summed exactly to the paper's printed pooled totals), the derived counts were entered and flagged derived in every affected row. In the robustness pass, a second extractor team re-extracted every included study from its full text without sight of the first extraction; the passes were compared field by field by code and every discrepancy was settled by a reader re-reading the source, with the outcome logged in robustness-discrepancy-log.md. Of the original studies' pooled inputs, settlements blanked 11 cells the first pass had filled on definitions that did not map exactly (including the fully accurate counts of Civelekler 2026 and the major inaccuracy counts of Athaluri 2023 and Dhaimade 2026), filled 5 cells the first pass had left blank (including Metze 2024, whose percentages at denominator 260 derive uniquely to counts), and removed one duplicate study (Jedrzejczak 2024, merged into Pastucha 2026).</w:t>
       </w:r>
     </w:p>
     <w:p>
@@ -916,7 +932,7 @@
         <w:rPr>
           <w:sz w:val="22"/>
         </w:rPr>
-        <w:t>Assessment of risk of bias. The adapted tool in rob-forms.md, specified before extraction, with eight domains. Two assessors judged all 25 generation studies apart (200 domain judgements, 56 disagreements). Judgements were adjudicated by taking the more cautious of the two per domain, a conservative rule stated here so a reader can rebuild the assessments from stage4/rob-assessor1.csv, stage4/rob-assessor2.csv and rob-assessments.csv. The tool is adapted; it is not RoB 2 and not QUADAS-2.</w:t>
+        <w:t>Assessment of risk of bias. The adapted tool in rob-forms.md, specified before extraction, with eight domains. Two assessors judged every generation study apart. In the first version, disagreements (56 domain and 5 overall, of 200 domain judgements) were adjudicated by taking the more cautious judgement; in the robustness pass an adjudicator re-judged every disagreement by reading the paper and both rationales, and the same process was run for the new studies. Two of the 25 original studies changed overall category (Athaluri 2023 and Sawamura 2024, high to some concerns). A reader can rebuild the assessments from the assessor sheets and rob-assessments-v2.csv. The tool is adapted; it is not RoB 2 and not QUADAS-2.</w:t>
       </w:r>
     </w:p>
     <w:p>
@@ -1004,7 +1020,7 @@
         <w:rPr>
           <w:sz w:val="22"/>
         </w:rPr>
-        <w:t>Records identified: 16,497 retrieved across all runs. Duplicates removed: 512. Records screened: 15,985. Records excluded at title and abstract after dual screening and adjudication: 15,863. Reports sought: 122. Reports not retrieved: 46. Reports assessed at full text: 76. Reports excluded at full text: 48, with one reason each in fulltext-screening.csv; the largest groups were reviews and editorials with no original experiment, duplicate reports of an experiment already captured, retrieval or detection tools with no generation experiment, non-biomedical reports with no separable biomedical data, and four reports whose retrieved file did not correspond to the record and whose correct text could not be obtained. Reports included: 27 generation experiment reports covering 25 unique studies, and 1 audit report. The full flow sits in prisma-flow.md and prisma-flow-diagram.png.</w:t>
+        <w:t>Records identified: 16,497 retrieved across all database runs, plus 979 citation chasing candidates of which 489 were new records. Duplicates removed: 512 from the database set and 36 within the chasing set. Records screened: 16,474. Records excluded at title and abstract after dual screening and adjudication by reading: 16,181. Reports sought: 293. Reports not retrieved: 115. Reports assessed at full text: 178. Reports excluded at full text: 111, with one reason each; the largest groups were reviews and editorials with no original experiment, duplicate reports of an experiment already captured, retrieval or detection tools with no generation experiment, non-biomedical reports with no separable biomedical data, and reports whose retrieved file did not correspond to the record and whose correct text could not be obtained. Reports included: 66 generation experiment reports covering 63 unique studies (one first version report, Jedrzejczak 2024, proved to be the preprint of Pastucha 2026 and is counted once, under Pastucha 2026), and 1 audit report. The full flow sits in prisma-flow.md and prisma-flow-diagram.png.</w:t>
       </w:r>
     </w:p>
     <w:p>
@@ -1012,7 +1028,7 @@
         <w:rPr>
           <w:sz w:val="22"/>
         </w:rPr>
-        <w:t>The 25 generation studies ran from 2023 to 2026 and covered, among other fields, radiology, orthopaedics, endodontics, neurocritical care, psychiatry and mental health, ophthalmology, otolaryngology, physical therapy and general biomedical topics. Sixty nine model arms were extracted. Models included the GPT family (the largest group), Gemini, Claude, DeepSeek, Bard, Copilot and several research systems in one study of AI research agents (Shi 2026). Verification sources were PubMed most often, then Crossref, Google Scholar and publisher records, named per arm in extraction.csv. Funding and conflicts were extracted per study; vendor involvement in the primary studies was uncommon in print, and several studies declared nothing either way, which the extraction records as not reported rather than as none.</w:t>
+        <w:t>The 63 generation studies ran from 2023 to 2026 and covered, among other fields, radiology, orthopaedics, endodontics, neurocritical care, psychiatry and mental health, ophthalmology, otolaryngology, physical therapy, nephrology, dentistry, spine surgery, trauma care and general biomedical topics. One hundred and forty eight model arms were extracted. Models included the GPT family (the largest group), Gemini, Claude, DeepSeek, Grok, Bard, Copilot and several research systems in one study of AI research agents (Shi 2026). Verification sources were PubMed most often, then Crossref, Google Scholar and publisher records, named per arm in extraction.csv. Funding and conflicts were extracted per study; vendor involvement in the primary studies was uncommon in print, and several studies declared nothing either way, which the extraction records as not reported rather than as none.</w:t>
       </w:r>
     </w:p>
     <w:p>
@@ -1028,7 +1044,7 @@
         <w:rPr>
           <w:sz w:val="22"/>
         </w:rPr>
-        <w:t>Adjudicated overall judgements: high risk in 15 of 25 studies, some concerns in 10, low in none. Verification conduct drove most high judgements: studies that never said who verified the references, or whether verification was duplicated or blinded, could not score well on domains 5 and 6, and domain 6 carried the most no information judgements of any domain. Unversioned models with no generation date drove domain 2 high judgements in three early studies. Two single domain cases stand out: Chelli 2024 kept a prompt because it yielded the most results, and Bernstein 2026 defined hallucination to include real studies not indexed in PubMed, which can inflate a fabricated count. The full summary sits in rob-summary.md.</w:t>
+        <w:t>Adjudicated overall judgements across the 63 generation studies: high risk in 30, some concerns in 33, low in none. In the original 24 studies (after the duplicate merge), real adjudication moved Athaluri 2023 and Sawamura 2024 from high to some concerns against the first version's mechanical rule; the remaining first version studies kept their categories. Verification conduct drove most high judgements: studies that never said who verified the references, or whether verification was duplicated or blinded, could not score well on domains 5 and 6, and domain 6 carried the most no information judgements of any domain. Unversioned models with no generation date drove domain 2 high judgements in three early studies. Two single domain cases stand out: Chelli 2024 kept a prompt because it yielded the most results, and Bernstein 2026 defined hallucination to include real studies not indexed in PubMed, which can inflate a fabricated count. The full summary sits in rob-summary.md.</w:t>
       </w:r>
     </w:p>
     <w:p>
@@ -1056,7 +1072,7 @@
         <w:rPr>
           <w:sz w:val="22"/>
         </w:rPr>
-        <w:t xml:space="preserve"> Fifty one arms from 18 studies carried a printed fabricated count, covering 12,828 generated references, of which 2,324 were fabricated (crude 18.1 percent). The random effects pooled proportion was 18.6 percent (95% CI 12.8 to 26.3), tau squared 2.47, I squared 97.7 percent, prediction interval 0.9 to 84.7 percent. The per study sensitivity pool gave 23.0 percent (13.3 to 36.8). Removing preprints gave 21.5 percent (13.6 to 32.4). Leave one family out pools sat between 17.8 and 21.4 percent, so no single family carries the result. In the low or some concerns sensitivity pool (25 arms, 7 studies) the estimate was 24.4 percent (14.6 to 37.9), which says the headline figure is not an artefact of the weakest studies.</w:t>
+        <w:t xml:space="preserve"> One hundred and thirteen arms from 50 studies carried a printed fabricated count, covering 22,461 generated references, of which 4,716 were fabricated (crude 21.0 percent). The random effects pooled proportion was 19.4 percent (95% CI 14.9 to 24.8), tau squared 2.59, I squared 97.1 percent, prediction interval 1.0 to 85.6 percent. The per study sensitivity pool gave 24.7 percent (18.2 to 32.5). Removing preprints gave 19.8 percent (15.1 to 25.6). Leave one family out pools sat between 15.9 and 21.1 percent, so no single family carries the result. In the low or some concerns sensitivity pool (69 arms, 29 studies) the estimate was 19.1 percent (13.8 to 25.8), which says the headline figure is not an artefact of the weakest studies. The first version's estimate on the uncorrected dataset was 18.6 percent (12.8 to 26.3); the corrected estimate sits inside that interval with a narrower one of its own, on more than twice the arms.</w:t>
       </w:r>
     </w:p>
     <w:p>
@@ -1076,7 +1092,7 @@
         <w:rPr>
           <w:sz w:val="22"/>
         </w:rPr>
-        <w:t xml:space="preserve"> Nine arms from 5 studies, 1,537 references, 522 with a major inaccuracy (crude 34.0 percent). Pooled 36.0 percent (19.8 to 56.3), tau squared 1.55, I squared 96.1 percent. The per study pool gave 43.1 percent (26.9 to 60.8). This pool is small because most studies graded errors on their own scales and only five printed a count that mapped exactly to the review definition. It should be read as an estimate from a thin slice of the literature, and the GRADE rating reflects that.</w:t>
+        <w:t xml:space="preserve"> Twenty arms from 14 studies, 2,668 references, 562 with a major inaccuracy (crude 21.1 percent). Pooled 16.5 percent (5.7 to 39.2), tau squared 6.48, I squared 96.7 percent, prediction interval 0.1 to 98.0 percent. The per study pool gave 26.8 percent (8.9 to 57.8). This pool changed the most in the robustness pass: settlement removed the first version's two largest contributors (Dhaimade 2026, whose major counts rested on a panel level category that is not a reference count, and Athaluri 2023, whose summed categories did not match the definition exactly) and added arms whose printed categories did map (among them Metze 2024 at 194 of 260). The first version's 36.0 percent should not be quoted; it rested on counts that do not survive a definition check. Even corrected, the pool is thin, because most studies graded errors on their own scales and only 14 printed a count that mapped exactly to the review definition, and the GRADE rating reflects that.</w:t>
       </w:r>
     </w:p>
     <w:p>
@@ -1096,7 +1112,7 @@
         <w:rPr>
           <w:sz w:val="22"/>
         </w:rPr>
-        <w:t xml:space="preserve"> Forty two arms from 13 studies, 12,002 references, 5,239 fully accurate (crude 43.7 percent). Pooled 29.4 percent (19.5 to 41.7), tau squared 3.10, I squared 98.5 percent, prediction interval 1.1 to 93.8 percent. The per study pool gave 41.2 percent (27.4 to 56.4), higher than the arm level pool because studies with many arms tended to include the weakest models. Removing preprints gave 30.3 percent (17.9 to 46.5). In the low or some concerns pool the estimate was 34.4 percent (22.3 to 48.8).</w:t>
+        <w:t xml:space="preserve"> Fifty eight arms from 28 studies, 14,224 references, 6,089 fully accurate (crude 42.8 percent). Pooled 37.0 percent (27.2 to 47.9), tau squared 2.89, I squared 98.2 percent, prediction interval 1.9 to 94.8 percent. The per study pool gave 38.2 percent (28.8 to 48.6), close to the arm level pool in the corrected set. Removing preprints gave 35.0 percent (24.6 to 47.1). In the low or some concerns pool (43 arms, 20 studies) the estimate was 39.1 percent (28.4 to 50.9). The first version's estimate was 29.4 percent (19.5 to 41.7); settlement blanked the loose accuracy counts of Civelekler 2026, Mugaanyi 2024 and Singh 2026, whose printed categories measured existence or relevance rather than accuracy on every checked field, and the enlarged study set pulled the estimate up.</w:t>
       </w:r>
     </w:p>
     <w:p>
@@ -1116,7 +1132,7 @@
         <w:rPr>
           <w:sz w:val="22"/>
         </w:rPr>
-        <w:t xml:space="preserve"> By model family, fabricated proportions pooled at 4.1 percent for Claude arms (5 arms, 1.4 to 11.9), 19.5 percent for GPT arms (26 arms, 12.5 to 29.0), 22.7 percent for Gemini arms (10 arms, 6.7 to 54.5) and 23.8 percent for DeepSeek arms (4 arms, 6.1 to 59.7). Fully accurate proportions by family were 74.6 percent for Claude (58.5 to 86.0), 24.5 percent for GPT (14.6 to 38.0) and 9.7 percent for Gemini (3.2 to 25.7). These family pools mix model generations and study topics, and the confidence intervals for Gemini and DeepSeek are wide; the family split is a description of this literature, not a league table of current products. By retrieval: arms with retrieval, browsing or database access active pooled 5.0 percent fabricated (5 arms, 1.4 to 16.4) against 25.1 percent for arms with retrieval off (30 arms, 16.0 to 37.1) and 15.1 percent where retrieval status was not reported (16 arms). Fully accurate with retrieval was 39.2 percent (13.0 to 73.6) against 21.8 percent with retrieval off (12.6 to 35.0). Only five retrieval arms exist in this literature, so the retrieval gap is the most interesting number in the review and the least settled. By publication type, fabricated pooled 21.5 percent in peer reviewed reports and 12.4 percent in preprints, a split that tracks model year more than editorial process and is not read as a quality signal. List length and model year subgroups are reported as not estimable in the Methods, with the arms that carried a printed requested count too few and too one sided (all above 10) to split.</w:t>
+        <w:t xml:space="preserve"> By model family (family labels normalised across reports for this analysis), fabricated proportions pooled at 5.9 percent for Claude arms (9 arms, 1.8 to 17.7), 24.4 percent for GPT arms (59 arms, 16.2 to 35.1), 21.7 percent for Gemini arms (15 arms, 10.4 to 39.9) and 29.6 percent for DeepSeek arms (10 arms, 12.7 to 54.8). Fully accurate proportions by family were 65.9 percent for Claude (9 arms, 36.1 to 86.8), 33.4 percent for GPT (38 arms, 22.2 to 46.9) and 23.6 percent for Gemini (7 arms, 8.7 to 49.9). These family pools mix model generations and study topics, and the confidence intervals for Gemini and DeepSeek are wide; the family split is a description of this literature, not a league table of current products. By retrieval: arms with retrieval, browsing or database access active pooled 5.8 percent fabricated (26 arms, 12 studies) against 31.0 percent for arms with retrieval off (50 arms) and 19.9 percent where retrieval status was not reported (37 arms). Fully accurate with retrieval was 50.7 percent (12 arms) against 34.3 percent with retrieval off (27 arms), and major inaccuracy with retrieval was 1.2 percent (6 arms) against 37.7 percent off (11 arms). The retrieval gap is now carried by 26 arms rather than five, and it is still the least settled number in the review, because retrieval arms cluster in later studies with later models. By publication type, fabricated pooled 19.8 percent in peer reviewed reports (106 arms) and 13.5 percent in preprints (7 arms), a split that tracks model year more than editorial process and is not read as a quality signal. List length and model year subgroups are reported as not estimable in the Methods, with the arms that carried a printed requested count too few and too one sided (all above 10) to split.</w:t>
       </w:r>
     </w:p>
     <w:p>
@@ -1156,7 +1172,7 @@
         <w:rPr>
           <w:sz w:val="22"/>
         </w:rPr>
-        <w:t xml:space="preserve"> Seven of the 25 studies contributed no arm to the fabricated pool, most often because they printed percentages without counts, graded accuracy on a composite score such as the Reference Hallucination Score without a whole reference fabricated count (Aljamaan 2024, Tas 2026, Metze 2024), or reported accuracy in a form that did not map to the review definitions. Their results are in extraction.csv and extraction-outcomes.csv and are described here so the pools are not mistaken for the whole included set.</w:t>
+        <w:t xml:space="preserve"> Thirteen of the 63 studies contributed no arm to the fabricated pool, most often because they printed percentages without counts, graded accuracy on a composite score such as the Reference Hallucination Score without a whole reference fabricated count (Aljamaan 2024, Tas 2026), or reported accuracy in a form that did not map to the review definitions after settlement (among the new studies, Liu 2026 and Woodrow 2025; Metze 2024 entered the pools in the robustness pass once its percentages were settled as uniquely derivable counts). Their results are in extraction.csv and extraction-outcomes.csv and are described here so the pools are not mistaken for the whole included set.</w:t>
       </w:r>
     </w:p>
     <w:p>
@@ -1164,7 +1180,7 @@
         <w:rPr>
           <w:sz w:val="22"/>
         </w:rPr>
-        <w:t>Forest plots for the three outcomes sit in forest-fabricated.png, forest-major_inaccuracy.png and forest-fully_accurate.png.</w:t>
+        <w:t>Forest plots are printed after the references in this manuscript: one by-study plot per outcome (Figures 1 to 3), with the random-effects pooled proportion drawn as a diamond and the prediction interval as a capped line under it, and arm-level panels in the appendix figures. The plot files are forest-fabricated-bystudy.png, forest-fully_accurate-bystudy.png and forest-major_inaccuracy-bystudy.png for the by-study plots, and forest-fabricated-arms-1 to 6.png, forest-fully_accurate-arms-1 to 3.png and forest-major_inaccuracy-arms-1.png for the arm panels, all produced by forest_plots_v2.py. An earlier plot build (forest_plots.py, files forest-fabricated.png, forest-major_inaccuracy.png and forest-fully_accurate.png) drew no summary diamond and its images overflowed the page in the first PDF, so the major inaccuracy plot was also left out of that PDF; the fault and the fix are logged in llm-team-log.md, and the first-build files are kept in the repository for the record.</w:t>
       </w:r>
     </w:p>
     <w:p>
@@ -1188,7 +1204,7 @@
         <w:rPr>
           <w:sz w:val="22"/>
         </w:rPr>
-        <w:t>Across 51 model arms and 12,828 checked references, 18.6 percent of LLM generated biomedical references were completely fabricated (95% CI 12.8 to 26.3). Across 42 arms and 12,002 references, 29.4 percent were fully accurate (19.5 to 41.7). A reference list from a model in these studies was therefore more likely to contain an invented paper than to be clean throughout, and the middle ground, real papers with wrong details, held the largest share of all. The major inaccuracy pool, 36.0 percent across a thin set of five studies, points the same way.</w:t>
+        <w:t>Across 113 model arms and 22,461 checked references, 19.4 percent of LLM generated biomedical references were completely fabricated (95% CI 14.9 to 24.8). Across 58 arms and 14,224 references, 37.0 percent were fully accurate (27.2 to 47.9). A reference list from a model in these studies was therefore still more likely to contain an invented paper than to be clean throughout, and the middle ground, real papers with wrong details, held the largest share of all. The major inaccuracy pool, 16.5 percent across 14 studies, points the same way on thinner data.</w:t>
       </w:r>
     </w:p>
     <w:p>
@@ -1196,7 +1212,7 @@
         <w:rPr>
           <w:sz w:val="22"/>
         </w:rPr>
-        <w:t>The averages are the least useful part of those numbers, because the prediction interval for fabrication runs from 0.9 to 84.7 percent. Within a single study that held topic and verification constant and varied only the model, fabrication ran from 15 of 480 references to 291 of 480 (Gunes 2026). A purchasing decision, an editorial policy or a personal habit built on the pooled 18.6 percent would be built on a number that describes almost no actual setup. What the review can support is narrower and stronger: fabrication is a property of a setup, it changes by an order of magnitude between setups, and no setup in 69 arms was error free across a full list.</w:t>
+        <w:t>The averages are the least useful part of those numbers, because the prediction interval for fabrication runs from 1.0 to 85.6 percent. Within a single study that held topic and verification constant and varied only the model, fabrication ran from 15 of 480 references to 291 of 480 (Gunes 2026). A purchasing decision, an editorial policy or a personal habit built on the pooled 19.4 percent would be built on a number that describes almost no actual setup. What the review can support is narrower and stronger: fabrication is a property of a setup, and it changes by an order of magnitude between setups. In the corrected set, exactly two of 148 arms were error free across a full list (OpenEvidence in McLaughlin 2026, 120 of 120 fully accurate; one 20 reference ChatGPT-4 arm in Zhu 2025), and both sat at the retrieval grounded end of the literature.</w:t>
       </w:r>
     </w:p>
     <w:p>
@@ -1204,7 +1220,7 @@
         <w:rPr>
           <w:sz w:val="22"/>
         </w:rPr>
-        <w:t>Retrieval is the one setup feature that separated cleanly, on thin data. Arms with browsing, retrieval or database access pooled 5.0 percent fabricated against 25.1 percent with retrieval off, and Pastucha 2026 shows the pattern inside one study, where turning web search on cut fabricated counts in the same model family from 82 of 396 and 103 of 530 to 7 of 296 and 4 of 301. Five retrieval arms cannot settle a claim of that size, and retrieval arms came from later studies with later models, so generation and retrieval effects are tangled. The claim the data carry is that the gap is large enough, and consistent enough across the few studies that tested it directly, that any future experiment which fails to state its retrieval status is wasting its readers' time. Sixteen of 51 fabricated arms did not report retrieval status at all.</w:t>
+        <w:t>Retrieval is the one setup feature that separated cleanly. Arms with browsing, retrieval or database access pooled 5.8 percent fabricated (26 arms) against 31.0 percent with retrieval off (50 arms), and Pastucha 2026 shows the pattern inside one study, where turning web search on cut fabricated counts in the same model family from 82 of 396 and 103 of 530 to 7 of 296 and 4 of 301. Twenty six retrieval arms still cannot settle a claim of that size, and retrieval arms came from later studies with later models, so generation and retrieval effects are tangled. The claim the data carry is that the gap is large enough, and consistent enough across the studies that tested it directly, that any future experiment which fails to state its retrieval status is wasting its readers' time. Thirty seven of 113 fabricated arms did not report retrieval status at all.</w:t>
       </w:r>
     </w:p>
     <w:p>
@@ -1212,7 +1228,7 @@
         <w:rPr>
           <w:sz w:val="22"/>
         </w:rPr>
-        <w:t>The family split will be the part of this review that gets quoted, so it gets its caveat in the same paragraph as its numbers. Claude arms pooled 4.1 percent fabricated and 74.6 percent fully accurate; GPT arms 19.5 percent and 24.5 percent; Gemini arms 22.7 percent and 9.7 percent. The Claude arms are five, they cluster in later studies (Adiguzel 2026 found 1 fabricated reference in 150 for Claude Sonnet 4.6 and 1 in 150 for ChatGPT 5, with the gap sitting in partial accuracy and DOI errors rather than invention), and family pools mix generations that differ more from each other than families do. Anyone quoting the family figures without the arm counts and intervals is misusing the review.</w:t>
+        <w:t>The family split will be the part of this review that gets quoted, so it gets its caveat in the same paragraph as its numbers. Claude arms pooled 5.9 percent fabricated and 65.9 percent fully accurate; GPT arms 24.4 percent and 33.4 percent; Gemini arms 21.7 percent and 23.6 percent. The Claude arms are nine, they cluster in later studies (Adiguzel 2026 found 1 fabricated reference in 150 for Claude Sonnet 4.6 and 1 in 150 for ChatGPT 5, with the gap sitting in partial accuracy and DOI errors rather than invention), and family pools mix generations that differ more from each other than families do. Anyone quoting the family figures without the arm counts and intervals is misusing the review.</w:t>
       </w:r>
     </w:p>
     <w:p>
@@ -1220,7 +1236,7 @@
         <w:rPr>
           <w:sz w:val="22"/>
         </w:rPr>
-        <w:t>The audit stratum turns a laboratory finding into a publishing problem. Yin 2026 estimated about 146,932 non-existent references across four large corpora in 2025, and Topaz 2026 counted fabricated references in about 1 in 277 published biomedical papers in early 2026, up from about 1 in 2,828 in 2023. Set against a pooled experimental fabrication rate of 18.6 percent per generated reference, the print rates look small, and they should: most published lists are human written or human checked, and peer review catches some invented entries. The direction is the point. The reservoir of generated, unchecked lists is large and growing, and the audits show the spill has started.</w:t>
+        <w:t>The audit stratum turns a laboratory finding into a publishing problem. Yin 2026 estimated about 146,932 non-existent references across four large corpora in 2025, and Topaz 2026 counted fabricated references in about 1 in 277 published biomedical papers in early 2026, up from about 1 in 2,828 in 2023. Set against a pooled experimental fabrication rate of 19.4 percent per generated reference, the print rates look small, and they should: most published lists are human written or human checked, and peer review catches some invented entries. The direction is the point. The reservoir of generated, unchecked lists is large and growing, and the audits show the spill has started.</w:t>
       </w:r>
     </w:p>
     <w:p>
@@ -1236,7 +1252,7 @@
         <w:rPr>
           <w:sz w:val="22"/>
         </w:rPr>
-        <w:t>No included study sat at low risk of bias on the adapted tool, and 15 of 25 sat at high risk. The dominant weakness was not fraud or sloppiness in generation; it was silence about verification. A reader often cannot tell who checked the references, against what, with what rule for a near match, or whether a second checker ever saw them. Where verification is the outcome measure, that silence caps what any synthesis can claim, and it capped this one at very low certainty on all three critical outcomes. Heterogeneity stayed above 95 percent in every main pool and no pre-specified subgroup explained it away, because studies differed in topic difficulty, prompt design, list length and grading stringency at the same time as they differed in model. Definition drift is real: one study counted a reference as hallucinated where any two of title, first author and year were wrong (Chelli 2024), another counted fabricated and misrepresented together (Singh 2026), and Bernstein 2026 counted real papers outside PubMed as hallucinated. Each definition is defensible in its own paper. Pooled, they measure a family of related failures rather than one failure, and the manuscript says so wherever the numbers appear.</w:t>
+        <w:t>No included study sat at low risk of bias on the adapted tool, and 30 of 63 sat at high risk. The dominant weakness was not fraud or sloppiness in generation; it was silence about verification. A reader often cannot tell who checked the references, against what, with what rule for a near match, or whether a second checker ever saw them. Where verification is the outcome measure, that silence caps what any synthesis can claim, and it capped this one at very low certainty on all three critical outcomes. Heterogeneity stayed above 95 percent in every main pool and no pre-specified subgroup explained it away, because studies differed in topic difficulty, prompt design, list length and grading stringency at the same time as they differed in model. Definition drift is real: one study counted a reference as hallucinated where any two of title, first author and year were wrong (Chelli 2024), another counted fabricated and misrepresented together (Singh 2026), and Bernstein 2026 counted real papers outside PubMed as hallucinated. Each definition is defensible in its own paper. Pooled, they measure a family of related failures rather than one failure, and the manuscript says so wherever the numbers appear.</w:t>
       </w:r>
     </w:p>
     <w:p>
@@ -1252,7 +1268,7 @@
         <w:rPr>
           <w:sz w:val="22"/>
         </w:rPr>
-        <w:t>This is a single author review built with LLM assistance, and its process limits are stated plainly. Screening used two LLM rule sets with a coded adjudicator, not two human screeners; agreement was high and kappa was low for prevalence reasons, and both figures are published. The search could not include Embase, Scopus or Web of Science, could not retrieve arXiv or Semantic Scholar past their rate limits, and took in a very broad Europe PMC set whose PMCID field proved unreliable for a number of records; that fault cost four reports their full text assessment and is reported in the team log rather than buried. Forty six reports that passed screening were never retrieved, and some of them are likely eligible; the included set is therefore the open access visible part of this literature, which may tilt it toward better reported studies. Risk of bias adjudication took the more cautious judgement wherever two assessors differed, which protects against optimism and may overstate risk for the five studies where overall judgements split. Extraction rested on printed counts; where a paper printed only percentages, its arms stayed out of the pools, which favours studies that reported completely.</w:t>
+        <w:t>This is a single author review built with LLM assistance, and its process limits are stated plainly. Screening used two LLM rule sets, not two human screeners; agreement was high and kappa was low for prevalence reasons, and both figures are published. The first version settled screening disagreements with a coded rule and risk of bias disagreements with a more-cautious-wins rule, and extracted once with a verification pass; the robustness pass replaced all three with adjudication and extraction by reading, and the corrected numbers in this version rest on those readings, but the underlying screeners, extractors and assessors are still LLM agents working apart under written rules, not human reviewers, and a human team might read borderline abstracts and definitions differently. The search could not include Embase, Scopus or Web of Science, could not retrieve arXiv or Semantic Scholar past their rate limits on either attempt, and could not complete full OpenAlex retrieval for the same reason; it took in a very broad Europe PMC set whose PMCID field proved unreliable for a number of records, a fault that cost four reports their full text assessment in the first pass and recurred in the pass, and is reported in the team log rather than buried. One hundred and fifteen reports that passed screening were never retrieved, and some of them are likely eligible; the included set is therefore the open access visible part of this literature, which may tilt it toward better reported studies. Extraction rested on printed counts; where a paper printed only percentages, its arms stayed out of the pools unless exactly one whole count reproduced the printed percentage, which favours studies that reported completely.</w:t>
       </w:r>
     </w:p>
     <w:p>
@@ -1268,7 +1284,7 @@
         <w:rPr>
           <w:sz w:val="22"/>
         </w:rPr>
-        <w:t>No earlier synthesis pooled these experiments, so there is no direct comparator for the headline figures. The findings agree with the mitigation review of Basu and Huynh (44 studies), which found retrieval approaches cutting hallucinations by 30 to 50 percent in the studies it covered; this review's retrieval split, 5.0 against 25.1 percent fabricated, is larger than that range and rests on far fewer arms, so the agreement is in direction, not size. The findings sit uneasily with vendor facing claims that citation accuracy in current models is a solved problem: the best single arm in this set (Claude Sonnet 4.6 in Adiguzel 2026, 1 fabricated in 150) coexists with a 2026 arm at 98 fabricated in 149 (UcarGundogar 2026, DeepSeek R1), both in peer reviewed reports from the same year. The review also disagrees, in method, with any reading of the audits that treats print prevalence as a model property: the audits measure a pipeline that includes authors, co-authors, reviewers and editors, and the experiments measure the model step of that pipeline.</w:t>
+        <w:t>No earlier synthesis pooled these experiments, so there is no direct comparator for the headline figures. The findings agree with the mitigation review of Basu and Huynh (44 studies), which found retrieval approaches cutting hallucinations by 30 to 50 percent in the studies it covered; this review's retrieval split, 5.8 against 31.0 percent fabricated, is larger than that range, so the agreement is in direction, not size. The findings sit uneasily with vendor facing claims that citation accuracy in current models is a solved problem: the best single arm in this set (Claude Sonnet 4.6 in Adiguzel 2026, 1 fabricated in 150) coexists with a 2026 arm at 98 fabricated in 149 (UcarGundogar 2026, DeepSeek R1), both in peer reviewed reports from the same year. The review also disagrees, in method, with any reading of the audits that treats print prevalence as a model property: the audits measure a pipeline that includes authors, co-authors, reviewers and editors, and the experiments measure the model step of that pipeline.</w:t>
       </w:r>
     </w:p>
     <w:p>
@@ -1292,7 +1308,7 @@
         <w:rPr>
           <w:sz w:val="22"/>
         </w:rPr>
-        <w:t>This review makes no clinical recommendation and nothing in it bears on the care of any patient. For the practice of writing, reviewing and editing research, the conclusions are these. A generated reference list should be treated as unverified text until every entry has been checked against a database, because 18.6 percent of generated references in these experiments did not exist and only 29.4 percent were fully accurate. Journals and institutions that ask authors to declare AI use could ask a sharper question at the same time: how was each AI assisted reference verified, and by whom. Librarians and research support staff are the group best placed to run that check at scale, which is why the journal route for this review targets their literature.</w:t>
+        <w:t>This review makes no clinical recommendation and nothing in it bears on the care of any patient. For the practice of writing, reviewing and editing research, the conclusions are these. A generated reference list should be treated as unverified text until every entry has been checked against a database, because 19.4 percent of generated references in these experiments did not exist and only 37.0 percent were fully accurate. Journals and institutions that ask authors to declare AI use could ask a sharper question at the same time: how was each AI assisted reference verified, and by whom. Librarians and research support staff are the group best placed to run that check at scale, which is why the journal route for this review targets their literature.</w:t>
       </w:r>
     </w:p>
     <w:p>
@@ -1356,7 +1372,7 @@
         <w:rPr>
           <w:sz w:val="22"/>
         </w:rPr>
-        <w:t>Data, code and other materials: the protocol, search log and results, screening files, extraction files, risk of bias assessments, analysis datasets (analysis-fabricated.csv, analysis-major_inaccuracy.csv, analysis-fully_accurate.csv), analysis code (analysis.py, forest_plots.py) and forest plots are published with this review in the GitHub repository and the Zenodo package. Licence: CC BY 4.0 for text and data, MIT for code.</w:t>
+        <w:t>Data, code and other materials: the protocol, search log and results, screening files, extraction files (including both independent passes and the settlement log from the robustness pass), risk of bias assessments, analysis datasets (analysis-fabricated.csv, analysis-major_inaccuracy.csv, analysis-fully_accurate.csv), analysis code (analysis.py, with analysis_norm.py carrying the controlled vocabulary normalisation used for subgroup analyses in the corrected version, and forest_plots_v2.py) and forest plots are published with this review in the GitHub repository and the Zenodo package. Licence: CC BY 4.0 for text and data, MIT for code.</w:t>
       </w:r>
     </w:p>
     <w:p>
@@ -1380,7 +1396,7 @@
         <w:rPr>
           <w:sz w:val="22"/>
         </w:rPr>
-        <w:t>Included generation studies (25): Adiguzel 2026 (endodontics); Aljamaan 2024 (Reference Hallucination Score); Athaluri 2023 (stem cell topics, Cureus); Bernstein 2026 (ChatGPT-5, AAOS guidelines); Chelli 2024 (systematic review references, JMIR); Civelekler 2026; Dhaimade 2026 (AAP in-service examination); Gravel 2023 (ChatGPT bibliography, psychiatry topics); Gunes 2026 (radiology); Hasnain 2025 (conjunctivitis); Hueber 2023 (rheumatology); Jedrzejczak 2024 (otolaryngology); Kutluay 2026 (ChatGPT-5.3, open fracture management); Linardon 2025 (mental health); Metze 2024 (ChatGPT-4 bibliographic research); Mugaanyi 2024 (cross disciplinary, biomedical subset); Nieves-Lopez 2026 (foot and ankle surgery examinations); Pastucha 2026; Sawamura 2024 (physical therapy); Seifi 2026 (neurocritical care); Shi 2026 (AI research systems); Singh 2026 (GPT-5, orthopaedic in-training examination); Tas 2026 (reference hallucination framework, large sample); Ucar 2026; UcarGundogar 2026 ( molar incisor hypomineralisation topics). Full citations, DOIs and record identifiers for every included study sit in extraction.csv and search-results.csv, which form part of this review's published data.</w:t>
+        <w:t>Included generation studies (63): Adıgüzel 2026 (dentistry, endodontics); Aiumtrakul 2023 (nephrology); Aljamaan 2024 (mixed biomedical); Athaluri 2023 (mixed biomedical); Awosanya 2024 (orthopaedic surgery); Bernstein 2026 (orthopaedic surgery, AAOS guidelines); Blasingame 2025 (mixed biomedical); Bridges 2025 (mixed biomedical); Chelli 2024 (systematic review references); Choi 2023 (pharmacology); Citir 2025 (dentistry); Civelekler 2026 (ophthalmology); Dhaimade 2026 (examination questions); DiFebo 2026 (cardiology); Eminovic 2026 (radiology and imaging); Ettien 2026 (mixed biomedical); Ghanem 2024 (orthopaedic trauma); Gravel 2023 (mixed biomedical); Gwon 2024 (urology); Güneş 2026 (radiology); Hack 2026 (otolaryngology); Hasnain 2025 (ophthalmology); Hueber 2023 (rheumatology); Idan 2025 (paediatrics and related fields); Jedrzejczak 2023 (audiology); Kang 2026 (paediatrics); Kaygisiz 2025 (dentistry); Knee 2025 (orthopaedic surgery); Knee 2026 (orthopaedic surgery); Kutluay 2026 (orthopaedics and traumatology); Lin 2025 (nephrology); Linardon 2025 (psychiatry and mental health); Liu 2026 (dentistry); McCavitt 2026 (orthopaedic surgery); McLaughlin 2026 (spine surgery); Metze 2024 (bibliographic research by professors); Mikus 2024 (pharmacology); Moskatel 2023 (neurology); Mugaanyi 2024 (cross disciplinary, biomedical subset); Naldi 2024 (dermatology); Nieves-Lopez 2026 (foot and ankle surgery); Ohlsen 2026 (orthopaedic surgery); Ok 2026 (urology); Pan 2026 (nursing and allied health); Pastucha 2026 (otorhinolaryngology; journal version of the study first reported as Jedrzejczak 2024, merged at study level in the robustness pass); Rao 2026 (plastic surgery); Safrai 2024 (reproductive medicine); Sawamura 2024 (physical therapy); Schumacher 2024 (ophthalmology); Schwartzman 2025 (orthopaedic surgery); Seifi 2026 (neurocritical care); Shi 2026 (AI research systems); Sina 2024 (otolaryngology); Singh 2026 (orthopaedic surgery); Suppadungsuk 2023 (nephrology); Tas 2026 (reference hallucination framework); Teke 2026 (dentistry); Uçar 2026 (dermatology); UçarGündoğar 2026 (dentistry); Warren 2024 (urology); Woodrow 2025 (orthopaedic surgery); Zhou 2026 (ophthalmology); Zhu 2025 (public health and epidemiology). Full citations, DOIs and record identifiers for every included study sit in extraction.csv and search-results.csv, which form part of this review's published data.</w:t>
       </w:r>
     </w:p>
     <w:p>
@@ -1423,16 +1439,17 @@
     <w:p>
       <w:pPr>
         <w:pStyle w:val="Heading1"/>
+        <w:keepNext/>
       </w:pPr>
       <w:r>
-        <w:t>Forest plot: completely fabricated</w:t>
+        <w:t>Forest plot: completely fabricated, by study</w:t>
       </w:r>
     </w:p>
     <w:p>
       <w:r>
         <w:drawing>
           <wp:inline xmlns:a="http://schemas.openxmlformats.org/drawingml/2006/main" xmlns:pic="http://schemas.openxmlformats.org/drawingml/2006/picture">
-            <wp:extent cx="5943600" cy="9699955"/>
+            <wp:extent cx="5194735" cy="7863839"/>
             <wp:docPr id="1" name="Picture 1"/>
             <wp:cNvGraphicFramePr>
               <a:graphicFrameLocks noChangeAspect="1"/>
@@ -1441,7 +1458,7 @@
               <a:graphicData uri="http://schemas.openxmlformats.org/drawingml/2006/picture">
                 <pic:pic>
                   <pic:nvPicPr>
-                    <pic:cNvPr id="0" name="forest-fabricated.png"/>
+                    <pic:cNvPr id="0" name="forest-fabricated-bystudy.png"/>
                     <pic:cNvPicPr/>
                   </pic:nvPicPr>
                   <pic:blipFill>
@@ -1453,7 +1470,7 @@
                   <pic:spPr>
                     <a:xfrm>
                       <a:off x="0" y="0"/>
-                      <a:ext cx="5943600" cy="9699955"/>
+                      <a:ext cx="5194735" cy="7863839"/>
                     </a:xfrm>
                     <a:prstGeom prst="rect"/>
                   </pic:spPr>
@@ -1465,18 +1482,27 @@
       </w:r>
     </w:p>
     <w:p>
+      <w:r>
+        <w:rPr>
+          <w:sz w:val="18"/>
+        </w:rPr>
+        <w:t>Figure 1. One row per study (study totals across its model arms). The diamond is the arm-level random-effects pooled proportion, 19.4% (95% CI 14.9 to 24.8); the capped line under it is the 95% prediction interval, 1.0 to 85.6%. The per-study sensitivity pool was 24.7%. Corrected version, robustness pass 23 October 2026 (first version: 18.6%, 51 arms).</w:t>
+      </w:r>
+    </w:p>
+    <w:p>
       <w:pPr>
         <w:pStyle w:val="Heading1"/>
+        <w:keepNext/>
       </w:pPr>
       <w:r>
-        <w:t>Forest plot: fully accurate</w:t>
+        <w:t>Forest plot: fully accurate, by study</w:t>
       </w:r>
     </w:p>
     <w:p>
       <w:r>
         <w:drawing>
           <wp:inline xmlns:a="http://schemas.openxmlformats.org/drawingml/2006/main" xmlns:pic="http://schemas.openxmlformats.org/drawingml/2006/picture">
-            <wp:extent cx="5943600" cy="7988198"/>
+            <wp:extent cx="6126480" cy="5423393"/>
             <wp:docPr id="2" name="Picture 2"/>
             <wp:cNvGraphicFramePr>
               <a:graphicFrameLocks noChangeAspect="1"/>
@@ -1485,7 +1511,7 @@
               <a:graphicData uri="http://schemas.openxmlformats.org/drawingml/2006/picture">
                 <pic:pic>
                   <pic:nvPicPr>
-                    <pic:cNvPr id="0" name="forest-fully_accurate.png"/>
+                    <pic:cNvPr id="0" name="forest-fully_accurate-bystudy.png"/>
                     <pic:cNvPicPr/>
                   </pic:nvPicPr>
                   <pic:blipFill>
@@ -1497,7 +1523,7 @@
                   <pic:spPr>
                     <a:xfrm>
                       <a:off x="0" y="0"/>
-                      <a:ext cx="5943600" cy="7988198"/>
+                      <a:ext cx="6126480" cy="5423393"/>
                     </a:xfrm>
                     <a:prstGeom prst="rect"/>
                   </pic:spPr>
@@ -1509,8 +1535,618 @@
       </w:r>
     </w:p>
     <w:p>
+      <w:r>
+        <w:rPr>
+          <w:sz w:val="18"/>
+        </w:rPr>
+        <w:t>Figure 2. One row per study. Diamond: arm-level pooled proportion fully accurate, 37.0% (95% CI 27.2 to 47.9); capped line: 95% prediction interval, 1.9 to 94.8%. Per-study sensitivity pool 38.2%.</w:t>
+      </w:r>
+    </w:p>
+    <w:p>
       <w:pPr>
         <w:pStyle w:val="Heading1"/>
+        <w:keepNext/>
+      </w:pPr>
+      <w:r>
+        <w:t>Forest plot: any major inaccuracy, by study</w:t>
+      </w:r>
+    </w:p>
+    <w:p>
+      <w:r>
+        <w:drawing>
+          <wp:inline xmlns:a="http://schemas.openxmlformats.org/drawingml/2006/main" xmlns:pic="http://schemas.openxmlformats.org/drawingml/2006/picture">
+            <wp:extent cx="6126480" cy="2972801"/>
+            <wp:docPr id="3" name="Picture 3"/>
+            <wp:cNvGraphicFramePr>
+              <a:graphicFrameLocks noChangeAspect="1"/>
+            </wp:cNvGraphicFramePr>
+            <a:graphic>
+              <a:graphicData uri="http://schemas.openxmlformats.org/drawingml/2006/picture">
+                <pic:pic>
+                  <pic:nvPicPr>
+                    <pic:cNvPr id="0" name="forest-major_inaccuracy-bystudy.png"/>
+                    <pic:cNvPicPr/>
+                  </pic:nvPicPr>
+                  <pic:blipFill>
+                    <a:blip r:embed="rId11"/>
+                    <a:stretch>
+                      <a:fillRect/>
+                    </a:stretch>
+                  </pic:blipFill>
+                  <pic:spPr>
+                    <a:xfrm>
+                      <a:off x="0" y="0"/>
+                      <a:ext cx="6126480" cy="2972801"/>
+                    </a:xfrm>
+                    <a:prstGeom prst="rect"/>
+                  </pic:spPr>
+                </pic:pic>
+              </a:graphicData>
+            </a:graphic>
+          </wp:inline>
+        </w:drawing>
+      </w:r>
+    </w:p>
+    <w:p>
+      <w:r>
+        <w:rPr>
+          <w:sz w:val="18"/>
+        </w:rPr>
+        <w:t>Figure 3. One row per study. Diamond: pooled proportion with any major inaccuracy including fabricated, 16.5% (95% CI 5.7 to 39.2), from 20 arms in 14 studies. The first version's figure for this outcome (36.0%, 9 arms in 5 studies) rested on counts that settlement found did not map to the definition and is superseded.</w:t>
+      </w:r>
+    </w:p>
+    <w:p>
+      <w:r>
+        <w:br w:type="page"/>
+      </w:r>
+    </w:p>
+    <w:p>
+      <w:pPr>
+        <w:pStyle w:val="Heading1"/>
+      </w:pPr>
+      <w:r>
+        <w:t>Appendix figures: forest plots by model arm</w:t>
+      </w:r>
+    </w:p>
+    <w:p>
+      <w:pPr>
+        <w:pStyle w:val="Heading1"/>
+        <w:keepNext/>
+      </w:pPr>
+      <w:r>
+        <w:t>Fabricated, arms 1 of 6</w:t>
+      </w:r>
+    </w:p>
+    <w:p>
+      <w:r>
+        <w:drawing>
+          <wp:inline xmlns:a="http://schemas.openxmlformats.org/drawingml/2006/main" xmlns:pic="http://schemas.openxmlformats.org/drawingml/2006/picture">
+            <wp:extent cx="6126480" cy="4376057"/>
+            <wp:docPr id="4" name="Picture 4"/>
+            <wp:cNvGraphicFramePr>
+              <a:graphicFrameLocks noChangeAspect="1"/>
+            </wp:cNvGraphicFramePr>
+            <a:graphic>
+              <a:graphicData uri="http://schemas.openxmlformats.org/drawingml/2006/picture">
+                <pic:pic>
+                  <pic:nvPicPr>
+                    <pic:cNvPr id="0" name="forest-fabricated-arms-1.png"/>
+                    <pic:cNvPicPr/>
+                  </pic:nvPicPr>
+                  <pic:blipFill>
+                    <a:blip r:embed="rId12"/>
+                    <a:stretch>
+                      <a:fillRect/>
+                    </a:stretch>
+                  </pic:blipFill>
+                  <pic:spPr>
+                    <a:xfrm>
+                      <a:off x="0" y="0"/>
+                      <a:ext cx="6126480" cy="4376057"/>
+                    </a:xfrm>
+                    <a:prstGeom prst="rect"/>
+                  </pic:spPr>
+                </pic:pic>
+              </a:graphicData>
+            </a:graphic>
+          </wp:inline>
+        </w:drawing>
+      </w:r>
+    </w:p>
+    <w:p>
+      <w:r>
+        <w:rPr>
+          <w:sz w:val="18"/>
+        </w:rPr>
+        <w:t>Fabricated, arms 1 of 6. The diamond on each panel is the overall arm-level pool.</w:t>
+      </w:r>
+    </w:p>
+    <w:p>
+      <w:pPr>
+        <w:pStyle w:val="Heading1"/>
+        <w:keepNext/>
+      </w:pPr>
+      <w:r>
+        <w:t>Fabricated, arms 2 of 6</w:t>
+      </w:r>
+    </w:p>
+    <w:p>
+      <w:r>
+        <w:drawing>
+          <wp:inline xmlns:a="http://schemas.openxmlformats.org/drawingml/2006/main" xmlns:pic="http://schemas.openxmlformats.org/drawingml/2006/picture">
+            <wp:extent cx="6126480" cy="4376057"/>
+            <wp:docPr id="5" name="Picture 5"/>
+            <wp:cNvGraphicFramePr>
+              <a:graphicFrameLocks noChangeAspect="1"/>
+            </wp:cNvGraphicFramePr>
+            <a:graphic>
+              <a:graphicData uri="http://schemas.openxmlformats.org/drawingml/2006/picture">
+                <pic:pic>
+                  <pic:nvPicPr>
+                    <pic:cNvPr id="0" name="forest-fabricated-arms-2.png"/>
+                    <pic:cNvPicPr/>
+                  </pic:nvPicPr>
+                  <pic:blipFill>
+                    <a:blip r:embed="rId13"/>
+                    <a:stretch>
+                      <a:fillRect/>
+                    </a:stretch>
+                  </pic:blipFill>
+                  <pic:spPr>
+                    <a:xfrm>
+                      <a:off x="0" y="0"/>
+                      <a:ext cx="6126480" cy="4376057"/>
+                    </a:xfrm>
+                    <a:prstGeom prst="rect"/>
+                  </pic:spPr>
+                </pic:pic>
+              </a:graphicData>
+            </a:graphic>
+          </wp:inline>
+        </w:drawing>
+      </w:r>
+    </w:p>
+    <w:p>
+      <w:r>
+        <w:rPr>
+          <w:sz w:val="18"/>
+        </w:rPr>
+        <w:t>Fabricated, arms 2 of 6.</w:t>
+      </w:r>
+    </w:p>
+    <w:p>
+      <w:pPr>
+        <w:pStyle w:val="Heading1"/>
+        <w:keepNext/>
+      </w:pPr>
+      <w:r>
+        <w:t>Fabricated, arms 3 of 6</w:t>
+      </w:r>
+    </w:p>
+    <w:p>
+      <w:r>
+        <w:drawing>
+          <wp:inline xmlns:a="http://schemas.openxmlformats.org/drawingml/2006/main" xmlns:pic="http://schemas.openxmlformats.org/drawingml/2006/picture">
+            <wp:extent cx="6126480" cy="4376057"/>
+            <wp:docPr id="6" name="Picture 6"/>
+            <wp:cNvGraphicFramePr>
+              <a:graphicFrameLocks noChangeAspect="1"/>
+            </wp:cNvGraphicFramePr>
+            <a:graphic>
+              <a:graphicData uri="http://schemas.openxmlformats.org/drawingml/2006/picture">
+                <pic:pic>
+                  <pic:nvPicPr>
+                    <pic:cNvPr id="0" name="forest-fabricated-arms-3.png"/>
+                    <pic:cNvPicPr/>
+                  </pic:nvPicPr>
+                  <pic:blipFill>
+                    <a:blip r:embed="rId14"/>
+                    <a:stretch>
+                      <a:fillRect/>
+                    </a:stretch>
+                  </pic:blipFill>
+                  <pic:spPr>
+                    <a:xfrm>
+                      <a:off x="0" y="0"/>
+                      <a:ext cx="6126480" cy="4376057"/>
+                    </a:xfrm>
+                    <a:prstGeom prst="rect"/>
+                  </pic:spPr>
+                </pic:pic>
+              </a:graphicData>
+            </a:graphic>
+          </wp:inline>
+        </w:drawing>
+      </w:r>
+    </w:p>
+    <w:p>
+      <w:r>
+        <w:rPr>
+          <w:sz w:val="18"/>
+        </w:rPr>
+        <w:t>Fabricated, arms 3 of 6.</w:t>
+      </w:r>
+    </w:p>
+    <w:p>
+      <w:pPr>
+        <w:pStyle w:val="Heading1"/>
+        <w:keepNext/>
+      </w:pPr>
+      <w:r>
+        <w:t>Fabricated, arms 4 of 6</w:t>
+      </w:r>
+    </w:p>
+    <w:p>
+      <w:r>
+        <w:drawing>
+          <wp:inline xmlns:a="http://schemas.openxmlformats.org/drawingml/2006/main" xmlns:pic="http://schemas.openxmlformats.org/drawingml/2006/picture">
+            <wp:extent cx="6126480" cy="4376057"/>
+            <wp:docPr id="7" name="Picture 7"/>
+            <wp:cNvGraphicFramePr>
+              <a:graphicFrameLocks noChangeAspect="1"/>
+            </wp:cNvGraphicFramePr>
+            <a:graphic>
+              <a:graphicData uri="http://schemas.openxmlformats.org/drawingml/2006/picture">
+                <pic:pic>
+                  <pic:nvPicPr>
+                    <pic:cNvPr id="0" name="forest-fabricated-arms-4.png"/>
+                    <pic:cNvPicPr/>
+                  </pic:nvPicPr>
+                  <pic:blipFill>
+                    <a:blip r:embed="rId15"/>
+                    <a:stretch>
+                      <a:fillRect/>
+                    </a:stretch>
+                  </pic:blipFill>
+                  <pic:spPr>
+                    <a:xfrm>
+                      <a:off x="0" y="0"/>
+                      <a:ext cx="6126480" cy="4376057"/>
+                    </a:xfrm>
+                    <a:prstGeom prst="rect"/>
+                  </pic:spPr>
+                </pic:pic>
+              </a:graphicData>
+            </a:graphic>
+          </wp:inline>
+        </w:drawing>
+      </w:r>
+    </w:p>
+    <w:p>
+      <w:r>
+        <w:rPr>
+          <w:sz w:val="18"/>
+        </w:rPr>
+        <w:t>Fabricated, arms 4 of 6.</w:t>
+      </w:r>
+    </w:p>
+    <w:p>
+      <w:pPr>
+        <w:pStyle w:val="Heading1"/>
+        <w:keepNext/>
+      </w:pPr>
+      <w:r>
+        <w:t>Fabricated, arms 5 of 6</w:t>
+      </w:r>
+    </w:p>
+    <w:p>
+      <w:r>
+        <w:drawing>
+          <wp:inline xmlns:a="http://schemas.openxmlformats.org/drawingml/2006/main" xmlns:pic="http://schemas.openxmlformats.org/drawingml/2006/picture">
+            <wp:extent cx="6126480" cy="4376057"/>
+            <wp:docPr id="8" name="Picture 8"/>
+            <wp:cNvGraphicFramePr>
+              <a:graphicFrameLocks noChangeAspect="1"/>
+            </wp:cNvGraphicFramePr>
+            <a:graphic>
+              <a:graphicData uri="http://schemas.openxmlformats.org/drawingml/2006/picture">
+                <pic:pic>
+                  <pic:nvPicPr>
+                    <pic:cNvPr id="0" name="forest-fabricated-arms-5.png"/>
+                    <pic:cNvPicPr/>
+                  </pic:nvPicPr>
+                  <pic:blipFill>
+                    <a:blip r:embed="rId16"/>
+                    <a:stretch>
+                      <a:fillRect/>
+                    </a:stretch>
+                  </pic:blipFill>
+                  <pic:spPr>
+                    <a:xfrm>
+                      <a:off x="0" y="0"/>
+                      <a:ext cx="6126480" cy="4376057"/>
+                    </a:xfrm>
+                    <a:prstGeom prst="rect"/>
+                  </pic:spPr>
+                </pic:pic>
+              </a:graphicData>
+            </a:graphic>
+          </wp:inline>
+        </w:drawing>
+      </w:r>
+    </w:p>
+    <w:p>
+      <w:r>
+        <w:rPr>
+          <w:sz w:val="18"/>
+        </w:rPr>
+        <w:t>Fabricated, arms 5 of 6.</w:t>
+      </w:r>
+    </w:p>
+    <w:p>
+      <w:pPr>
+        <w:pStyle w:val="Heading1"/>
+        <w:keepNext/>
+      </w:pPr>
+      <w:r>
+        <w:t>Fabricated, arms 6 of 6, with the prediction interval</w:t>
+      </w:r>
+    </w:p>
+    <w:p>
+      <w:r>
+        <w:drawing>
+          <wp:inline xmlns:a="http://schemas.openxmlformats.org/drawingml/2006/main" xmlns:pic="http://schemas.openxmlformats.org/drawingml/2006/picture">
+            <wp:extent cx="6126480" cy="1867118"/>
+            <wp:docPr id="9" name="Picture 9"/>
+            <wp:cNvGraphicFramePr>
+              <a:graphicFrameLocks noChangeAspect="1"/>
+            </wp:cNvGraphicFramePr>
+            <a:graphic>
+              <a:graphicData uri="http://schemas.openxmlformats.org/drawingml/2006/picture">
+                <pic:pic>
+                  <pic:nvPicPr>
+                    <pic:cNvPr id="0" name="forest-fabricated-arms-6.png"/>
+                    <pic:cNvPicPr/>
+                  </pic:nvPicPr>
+                  <pic:blipFill>
+                    <a:blip r:embed="rId17"/>
+                    <a:stretch>
+                      <a:fillRect/>
+                    </a:stretch>
+                  </pic:blipFill>
+                  <pic:spPr>
+                    <a:xfrm>
+                      <a:off x="0" y="0"/>
+                      <a:ext cx="6126480" cy="1867118"/>
+                    </a:xfrm>
+                    <a:prstGeom prst="rect"/>
+                  </pic:spPr>
+                </pic:pic>
+              </a:graphicData>
+            </a:graphic>
+          </wp:inline>
+        </w:drawing>
+      </w:r>
+    </w:p>
+    <w:p>
+      <w:r>
+        <w:rPr>
+          <w:sz w:val="18"/>
+        </w:rPr>
+        <w:t>Fabricated, arms 6 of 6, with the prediction interval.</w:t>
+      </w:r>
+    </w:p>
+    <w:p>
+      <w:pPr>
+        <w:pStyle w:val="Heading1"/>
+        <w:keepNext/>
+      </w:pPr>
+      <w:r>
+        <w:t>Fully accurate, arms 1 of 3</w:t>
+      </w:r>
+    </w:p>
+    <w:p>
+      <w:r>
+        <w:drawing>
+          <wp:inline xmlns:a="http://schemas.openxmlformats.org/drawingml/2006/main" xmlns:pic="http://schemas.openxmlformats.org/drawingml/2006/picture">
+            <wp:extent cx="6126480" cy="4376057"/>
+            <wp:docPr id="10" name="Picture 10"/>
+            <wp:cNvGraphicFramePr>
+              <a:graphicFrameLocks noChangeAspect="1"/>
+            </wp:cNvGraphicFramePr>
+            <a:graphic>
+              <a:graphicData uri="http://schemas.openxmlformats.org/drawingml/2006/picture">
+                <pic:pic>
+                  <pic:nvPicPr>
+                    <pic:cNvPr id="0" name="forest-fully_accurate-arms-1.png"/>
+                    <pic:cNvPicPr/>
+                  </pic:nvPicPr>
+                  <pic:blipFill>
+                    <a:blip r:embed="rId18"/>
+                    <a:stretch>
+                      <a:fillRect/>
+                    </a:stretch>
+                  </pic:blipFill>
+                  <pic:spPr>
+                    <a:xfrm>
+                      <a:off x="0" y="0"/>
+                      <a:ext cx="6126480" cy="4376057"/>
+                    </a:xfrm>
+                    <a:prstGeom prst="rect"/>
+                  </pic:spPr>
+                </pic:pic>
+              </a:graphicData>
+            </a:graphic>
+          </wp:inline>
+        </w:drawing>
+      </w:r>
+    </w:p>
+    <w:p>
+      <w:r>
+        <w:rPr>
+          <w:sz w:val="18"/>
+        </w:rPr>
+        <w:t>Fully accurate, arms 1 of 3.</w:t>
+      </w:r>
+    </w:p>
+    <w:p>
+      <w:pPr>
+        <w:pStyle w:val="Heading1"/>
+        <w:keepNext/>
+      </w:pPr>
+      <w:r>
+        <w:t>Fully accurate, arms 2 of 3</w:t>
+      </w:r>
+    </w:p>
+    <w:p>
+      <w:r>
+        <w:drawing>
+          <wp:inline xmlns:a="http://schemas.openxmlformats.org/drawingml/2006/main" xmlns:pic="http://schemas.openxmlformats.org/drawingml/2006/picture">
+            <wp:extent cx="6126480" cy="4376057"/>
+            <wp:docPr id="11" name="Picture 11"/>
+            <wp:cNvGraphicFramePr>
+              <a:graphicFrameLocks noChangeAspect="1"/>
+            </wp:cNvGraphicFramePr>
+            <a:graphic>
+              <a:graphicData uri="http://schemas.openxmlformats.org/drawingml/2006/picture">
+                <pic:pic>
+                  <pic:nvPicPr>
+                    <pic:cNvPr id="0" name="forest-fully_accurate-arms-2.png"/>
+                    <pic:cNvPicPr/>
+                  </pic:nvPicPr>
+                  <pic:blipFill>
+                    <a:blip r:embed="rId19"/>
+                    <a:stretch>
+                      <a:fillRect/>
+                    </a:stretch>
+                  </pic:blipFill>
+                  <pic:spPr>
+                    <a:xfrm>
+                      <a:off x="0" y="0"/>
+                      <a:ext cx="6126480" cy="4376057"/>
+                    </a:xfrm>
+                    <a:prstGeom prst="rect"/>
+                  </pic:spPr>
+                </pic:pic>
+              </a:graphicData>
+            </a:graphic>
+          </wp:inline>
+        </w:drawing>
+      </w:r>
+    </w:p>
+    <w:p>
+      <w:r>
+        <w:rPr>
+          <w:sz w:val="18"/>
+        </w:rPr>
+        <w:t>Fully accurate, arms 2 of 3.</w:t>
+      </w:r>
+    </w:p>
+    <w:p>
+      <w:pPr>
+        <w:pStyle w:val="Heading1"/>
+        <w:keepNext/>
+      </w:pPr>
+      <w:r>
+        <w:t>Fully accurate, arms 3 of 3, with the prediction interval</w:t>
+      </w:r>
+    </w:p>
+    <w:p>
+      <w:r>
+        <w:drawing>
+          <wp:inline xmlns:a="http://schemas.openxmlformats.org/drawingml/2006/main" xmlns:pic="http://schemas.openxmlformats.org/drawingml/2006/picture">
+            <wp:extent cx="6126480" cy="2972801"/>
+            <wp:docPr id="12" name="Picture 12"/>
+            <wp:cNvGraphicFramePr>
+              <a:graphicFrameLocks noChangeAspect="1"/>
+            </wp:cNvGraphicFramePr>
+            <a:graphic>
+              <a:graphicData uri="http://schemas.openxmlformats.org/drawingml/2006/picture">
+                <pic:pic>
+                  <pic:nvPicPr>
+                    <pic:cNvPr id="0" name="forest-fully_accurate-arms-3.png"/>
+                    <pic:cNvPicPr/>
+                  </pic:nvPicPr>
+                  <pic:blipFill>
+                    <a:blip r:embed="rId20"/>
+                    <a:stretch>
+                      <a:fillRect/>
+                    </a:stretch>
+                  </pic:blipFill>
+                  <pic:spPr>
+                    <a:xfrm>
+                      <a:off x="0" y="0"/>
+                      <a:ext cx="6126480" cy="2972801"/>
+                    </a:xfrm>
+                    <a:prstGeom prst="rect"/>
+                  </pic:spPr>
+                </pic:pic>
+              </a:graphicData>
+            </a:graphic>
+          </wp:inline>
+        </w:drawing>
+      </w:r>
+    </w:p>
+    <w:p>
+      <w:r>
+        <w:rPr>
+          <w:sz w:val="18"/>
+        </w:rPr>
+        <w:t>Fully accurate, arms 3 of 3, with the prediction interval.</w:t>
+      </w:r>
+    </w:p>
+    <w:p>
+      <w:r>
+        <w:br w:type="page"/>
+      </w:r>
+    </w:p>
+    <w:p>
+      <w:pPr>
+        <w:pStyle w:val="Heading1"/>
+        <w:keepNext/>
+      </w:pPr>
+      <w:r>
+        <w:t>Any major inaccuracy, all 20 arms</w:t>
+      </w:r>
+    </w:p>
+    <w:p>
+      <w:r>
+        <w:drawing>
+          <wp:inline xmlns:a="http://schemas.openxmlformats.org/drawingml/2006/main" xmlns:pic="http://schemas.openxmlformats.org/drawingml/2006/picture">
+            <wp:extent cx="6126480" cy="4025973"/>
+            <wp:docPr id="13" name="Picture 13"/>
+            <wp:cNvGraphicFramePr>
+              <a:graphicFrameLocks noChangeAspect="1"/>
+            </wp:cNvGraphicFramePr>
+            <a:graphic>
+              <a:graphicData uri="http://schemas.openxmlformats.org/drawingml/2006/picture">
+                <pic:pic>
+                  <pic:nvPicPr>
+                    <pic:cNvPr id="0" name="forest-major_inaccuracy-arms-1.png"/>
+                    <pic:cNvPicPr/>
+                  </pic:nvPicPr>
+                  <pic:blipFill>
+                    <a:blip r:embed="rId21"/>
+                    <a:stretch>
+                      <a:fillRect/>
+                    </a:stretch>
+                  </pic:blipFill>
+                  <pic:spPr>
+                    <a:xfrm>
+                      <a:off x="0" y="0"/>
+                      <a:ext cx="6126480" cy="4025973"/>
+                    </a:xfrm>
+                    <a:prstGeom prst="rect"/>
+                  </pic:spPr>
+                </pic:pic>
+              </a:graphicData>
+            </a:graphic>
+          </wp:inline>
+        </w:drawing>
+      </w:r>
+    </w:p>
+    <w:p>
+      <w:r>
+        <w:rPr>
+          <w:sz w:val="18"/>
+        </w:rPr>
+        <w:t>Any major inaccuracy, all 20 arms.</w:t>
+      </w:r>
+    </w:p>
+    <w:p>
+      <w:pPr>
+        <w:pStyle w:val="Heading1"/>
+        <w:keepNext/>
       </w:pPr>
       <w:r>
         <w:t>PRISMA flow diagram</w:t>
@@ -1520,8 +2156,8 @@
       <w:r>
         <w:drawing>
           <wp:inline xmlns:a="http://schemas.openxmlformats.org/drawingml/2006/main" xmlns:pic="http://schemas.openxmlformats.org/drawingml/2006/picture">
-            <wp:extent cx="5029200" cy="6508376"/>
-            <wp:docPr id="3" name="Picture 3"/>
+            <wp:extent cx="6126479" cy="7473283"/>
+            <wp:docPr id="14" name="Picture 14"/>
             <wp:cNvGraphicFramePr>
               <a:graphicFrameLocks noChangeAspect="1"/>
             </wp:cNvGraphicFramePr>
@@ -1533,7 +2169,7 @@
                     <pic:cNvPicPr/>
                   </pic:nvPicPr>
                   <pic:blipFill>
-                    <a:blip r:embed="rId11"/>
+                    <a:blip r:embed="rId22"/>
                     <a:stretch>
                       <a:fillRect/>
                     </a:stretch>
@@ -1541,7 +2177,7 @@
                   <pic:spPr>
                     <a:xfrm>
                       <a:off x="0" y="0"/>
-                      <a:ext cx="5029200" cy="6508376"/>
+                      <a:ext cx="6126479" cy="7473283"/>
                     </a:xfrm>
                     <a:prstGeom prst="rect"/>
                   </pic:spPr>

</xml_diff>